<commit_message>
updated code new FSC 7th Oct
</commit_message>
<xml_diff>
--- a/docs/field-service-schedule-board-guide.docx
+++ b/docs/field-service-schedule-board-guide.docx
@@ -1873,7 +1873,7 @@
                 <w:sz w:val="20"/>
                 <w:szCs w:val="20"/>
               </w:rPr>
-              <w:t xml:space="preserve">WO# · Customer · City/State/Postal Code · Duration</w:t>
+              <w:t xml:space="preserve">WO# · Customer · City/State/UK Postal Code · Duration</w:t>
             </w:r>
           </w:p>
         </w:tc>
@@ -1980,7 +1980,7 @@
                 <w:sz w:val="20"/>
                 <w:szCs w:val="20"/>
               </w:rPr>
-              <w:t xml:space="preserve">Customer · City/State/Postal Code · Status · Notes</w:t>
+              <w:t xml:space="preserve">Customer · City/State/UK Postal Code · Status · Notes</w:t>
             </w:r>
           </w:p>
         </w:tc>
@@ -2517,7 +2517,7 @@
                 <w:sz w:val="21"/>
                 <w:szCs w:val="21"/>
               </w:rPr>
-              <w:t xml:space="preserve">R1 = Blue · R2 = Yellow · R3 = Violet · R4 = Sky Blue (jobs), Yellow (potential), Orange (custom) · R5 = Lighter Salmon · R99 = Gray. Any chip colour can be overridden per-entry from the add/edit dialog.</w:t>
+              <w:t xml:space="preserve">R1 = Blue · R2 = Yellow · R3 = Violet · R4 = Sky Blue (jobs), Yellow (potential), Orange (custom) · R5 = Colour 11 (pink) · R99 = Gray. Any chip colour can be overridden per-entry from the add/edit dialog.</w:t>
             </w:r>
           </w:p>
         </w:tc>

</xml_diff>